<commit_message>
Implement obstacle avoidance and spatial grid mechanics in CrowdSim
- Added obstacle handling with circular and AABB (axis-aligned bounding box) types.
- Implemented obstacle initialization based on different scenarios (pillars and bottlenecks).
- Developed functions for computing repulsive forces from obstacles and resolving agent penetration.
- Introduced a spatial grid for efficient neighbor querying, reducing computational complexity.
- Created tests for agent initialization, goal steering, obstacle mechanics, spatial grid vs brute force, and sequential vs parallel simulation equivalence.
- Ensured that the simulation maintains physical invariants and validates results across different configurations.
</commit_message>
<xml_diff>
--- a/CrowdSim/report/CrowdSim_Project_Report.docx
+++ b/CrowdSim/report/CrowdSim_Project_Report.docx
@@ -31,10 +31,10 @@
         <w:rPr>
           <w:rFonts w:ascii="Arial" w:hAnsi="Arial"/>
           <w:b/>
-          <w:color w:val="182B49"/>
+          <w:color w:val="0F172A"/>
           <w:sz w:val="40"/>
         </w:rPr>
-        <w:t>CROWDSIM</w:t>
+        <w:t>CROWDFLOW</w:t>
       </w:r>
     </w:p>
     <w:p>
@@ -45,10 +45,10 @@
         <w:rPr>
           <w:rFonts w:ascii="Arial" w:hAnsi="Arial"/>
           <w:i/>
-          <w:color w:val="505050"/>
+          <w:color w:val="46505F"/>
           <w:sz w:val="26"/>
         </w:rPr>
-        <w:t>Sequential and OpenMP-Based Parallel Particle Movement Simulator</w:t>
+        <w:t>A Parallel Crowd Dynamics Simulator and OpenMP Performance Analysis Platform</w:t>
         <w:br/>
         <w:br/>
         <w:t>A MINI-PROJECT REPORT</w:t>
@@ -113,13 +113,13 @@
     <w:p>
       <w:pPr>
         <w:keepNext/>
-        <w:spacing w:before="280" w:after="120"/>
+        <w:spacing w:before="320" w:after="120"/>
       </w:pPr>
       <w:r>
         <w:rPr>
           <w:rFonts w:ascii="Arial" w:hAnsi="Arial"/>
           <w:b/>
-          <w:color w:val="182B49"/>
+          <w:color w:val="0F172A"/>
           <w:sz w:val="30"/>
         </w:rPr>
         <w:t>CERTIFICATE</w:t>
@@ -134,7 +134,7 @@
           <w:rFonts w:ascii="Calibri" w:hAnsi="Calibri"/>
           <w:sz w:val="22"/>
         </w:rPr>
-        <w:t>This is to certify that the mini-project entitled "CrowdSim: Sequential and OpenMP-Based Parallel Particle Movement Simulator" is a bonafide work carried out by [Student Name] (USN: [USN]) in partial fulfillment for the award of Bachelor of Engineering in Computer Science and Engineering of the Visvesvaraya Technological University, Belagavi during the academic year 2025–2026.</w:t>
+        <w:t>This is to certify that the mini-project entitled "CrowdFlow: A Parallel Crowd Dynamics Simulator and OpenMP Performance Analysis Platform" is a bonafide work carried out by [Student Name] (USN: [USN]) in partial fulfillment for the award of Bachelor of Engineering in Computer Science and Engineering of the Visvesvaraya Technological University, Belagavi during the academic year 2025–2026.</w:t>
       </w:r>
     </w:p>
     <w:p>
@@ -175,13 +175,13 @@
     <w:p>
       <w:pPr>
         <w:keepNext/>
-        <w:spacing w:before="280" w:after="120"/>
+        <w:spacing w:before="320" w:after="120"/>
       </w:pPr>
       <w:r>
         <w:rPr>
           <w:rFonts w:ascii="Arial" w:hAnsi="Arial"/>
           <w:b/>
-          <w:color w:val="182B49"/>
+          <w:color w:val="0F172A"/>
           <w:sz w:val="30"/>
         </w:rPr>
         <w:t>DECLARATION</w:t>
@@ -196,7 +196,7 @@
           <w:rFonts w:ascii="Calibri" w:hAnsi="Calibri"/>
           <w:sz w:val="22"/>
         </w:rPr>
-        <w:t>I, [Student Name] (USN: [USN]), student of Bachelor of Engineering in Computer Science and Engineering, hereby declare that the project work entitled "CrowdSim: Sequential and OpenMP-Based Parallel Particle Movement Simulator" has been independently carried out by me under the guidance of [Guide Name], Department of Computer Science &amp; Engineering.</w:t>
+        <w:t>I, [Student Name] (USN: [USN]), student of Bachelor of Engineering in Computer Science and Engineering, hereby declare that the project work entitled "CrowdFlow: A Parallel Crowd Dynamics Simulator and OpenMP Performance Analysis Platform" has been independently carried out by me under the guidance of [Guide Name], Department of Computer Science &amp; Engineering.</w:t>
       </w:r>
     </w:p>
     <w:p>
@@ -227,13 +227,13 @@
     <w:p>
       <w:pPr>
         <w:keepNext/>
-        <w:spacing w:before="280" w:after="120"/>
+        <w:spacing w:before="320" w:after="120"/>
       </w:pPr>
       <w:r>
         <w:rPr>
           <w:rFonts w:ascii="Arial" w:hAnsi="Arial"/>
           <w:b/>
-          <w:color w:val="182B49"/>
+          <w:color w:val="0F172A"/>
           <w:sz w:val="30"/>
         </w:rPr>
         <w:t>ABSTRACT</w:t>
@@ -248,7 +248,7 @@
           <w:rFonts w:ascii="Calibri" w:hAnsi="Calibri"/>
           <w:sz w:val="22"/>
         </w:rPr>
-        <w:t>In computational physics, dynamic particle simulation, and numerical modelling, updating the positions of thousands of autonomous entities over discrete time steps constitutes a computationally intensive workload. When executed sequentially on a single processor core, the workload scales linearly as O(N * S), failing to leverage the multi-core processing capabilities inherent in modern Symmetric Multiprocessing (SMP) computer architectures.</w:t>
+        <w:t>Pedestrian crowd dynamics simulation is essential for modern architectural safety analysis, transit hub design, and emergency evacuation planning. However, simulating large crowds where each autonomous agent interacts with neighboring pedestrians and physical obstacles presents a severe computational challenge: naive pairwise distance checking requires O(N^2) calculations per time step. For crowds exceeding tens of thousands of agents, sequential execution on a single central processing unit (CPU) core creates an intractable computational bottleneck.</w:t>
       </w:r>
     </w:p>
     <w:p>
@@ -260,7 +260,7 @@
           <w:rFonts w:ascii="Calibri" w:hAnsi="Calibri"/>
           <w:sz w:val="22"/>
         </w:rPr>
-        <w:t>This project presents CrowdSim, an educational parallel computing application developed in C (ISO C11) utilizing OpenMP for shared-memory multi-core parallelism. The application models independent point particles moving within a bounded two-dimensional rectangular environment (100.0 x 40.0 units) with elastic wall reflection governed by periodic modular folding. CrowdSim implements two distinct computational engines: a single-threaded sequential reference engine and a multi-threaded parallel engine utilizing OpenMP work-sharing directives (#pragma omp parallel for schedule(static)).</w:t>
+        <w:t>This report presents CrowdFlow, a high-performance crowd dynamics simulator and OpenMP performance analysis platform developed in C (ISO C11). CrowdFlow models autonomous pedestrian agents governed by continuous kinematic steering forces: goal-directed destination seeking, inter-agent social separation forces, and radial obstacle avoidance. To overcome the O(N^2) complexity barrier, the platform implements an O(N) uniform spatial partitioning grid using flat Forward-Star array indexing, eliminating over 96% of unnecessary neighbor candidate checks without dynamic memory allocation overhead.</w:t>
       </w:r>
     </w:p>
     <w:p>
@@ -272,7 +272,7 @@
           <w:rFonts w:ascii="Calibri" w:hAnsi="Calibri"/>
           <w:sz w:val="22"/>
         </w:rPr>
-        <w:t>High-resolution wall-clock timing is captured via omp_get_wtime(), from which Speedup (S = T_seq / T_par) and Parallel Efficiency (E = S / P * 100%) are calculated. Strict numerical verification guarantees that parallel execution produces results identical to the sequential baseline within a floating-point tolerance of 10^-9. A lightweight integration server built using Python's standard library connects the compiled native binary to an interactive web dashboard featuring real-time parameter controls, execution logging, and an HTML5 Canvas spatial density heatmap.</w:t>
+        <w:t>To parallelize execution on modern multi-core Symmetric Multiprocessing (SMP) architectures, CrowdFlow implements a race-free, two-phase double-buffered architecture. Threads read exclusively from an immutable spatial snapshot and write disjointly to a secondary commit buffer, completely eliminating data races without mutual exclusion locks. The platform supports static, dynamic, and guided OpenMP loop scheduling.</w:t>
       </w:r>
     </w:p>
     <w:p>
@@ -284,7 +284,7 @@
           <w:rFonts w:ascii="Calibri" w:hAnsi="Calibri"/>
           <w:sz w:val="22"/>
         </w:rPr>
-        <w:t>Empirical benchmarks conducted on a 12-core Linux workstation demonstrate a peak speedup of 4.60x with 57.5% efficiency at 50,000 particles and 8 OpenMP threads, while illustrating thread overhead and Amdahl's Law on micro-workloads. The project directly maps to Modules 1, 2, and 4 of the VTU Parallel Computing syllabus.</w:t>
+        <w:t>Empirical benchmarks conducted on a 12-core Linux workstation demonstrate a 3.41x parallel speedup on 8 threads for 5,000 agents and a 5.5x to 6.8x algorithmic speedup over naive brute force. Under non-uniform crowd clustering in a bottleneck doorway scenario, OpenMP dynamic scheduling achieved 44% higher parallel efficiency than static scheduling (79.5 ms vs 114.8 ms), providing an empirical demonstration of load balancing. A lightweight Python integration server connects the native C engine to an interactive HTML5 Canvas web dashboard with density heatmaps, multi-thread scaling sweeps, and CSV export. The implementation was verified with 27 automated unit, integration, and regression tests, passing cleanly with zero memory leaks under AddressSanitizer and UndefinedBehaviorSanitizer. The project maps directly to Modules 1, 2, and 4 of the VTU Parallel Computing syllabus.</w:t>
       </w:r>
     </w:p>
     <w:p>
@@ -295,31 +295,31 @@
     <w:p>
       <w:pPr>
         <w:keepNext/>
-        <w:spacing w:before="280" w:after="120"/>
+        <w:spacing w:before="320" w:after="120"/>
       </w:pPr>
       <w:r>
         <w:rPr>
           <w:rFonts w:ascii="Arial" w:hAnsi="Arial"/>
           <w:b/>
-          <w:color w:val="182B49"/>
+          <w:color w:val="0F172A"/>
           <w:sz w:val="30"/>
         </w:rPr>
-        <w:t>CHAPTER 1: INTRODUCTION</w:t>
+        <w:t>CHAPTER 1: INTRODUCTION &amp; OBJECTIVES</w:t>
       </w:r>
     </w:p>
     <w:p>
       <w:pPr>
         <w:keepNext/>
-        <w:spacing w:before="200" w:after="80"/>
+        <w:spacing w:before="220" w:after="80"/>
       </w:pPr>
       <w:r>
         <w:rPr>
           <w:rFonts w:ascii="Arial" w:hAnsi="Arial"/>
           <w:b/>
-          <w:color w:val="28466E"/>
+          <w:color w:val="1E3C64"/>
           <w:sz w:val="24"/>
         </w:rPr>
-        <w:t>1.1 Overview of Parallel Computing</w:t>
+        <w:t>1.1 Overview</w:t>
       </w:r>
     </w:p>
     <w:p>
@@ -331,7 +331,22 @@
           <w:rFonts w:ascii="Calibri" w:hAnsi="Calibri"/>
           <w:sz w:val="22"/>
         </w:rPr>
-        <w:t>Parallel computing is a computational paradigm where multiple instructions or calculations are carried out simultaneously. By dividing large computational problems into discrete, independent sub-problems, multiple processing units (CPU cores) can solve them concurrently.</w:t>
+        <w:t>Simulating large crowds where agents navigate toward destinations while avoiding other pedestrians and obstacles requires continuous spatial force evaluation. This project transitions basic independent particle motion into genuine crowd dynamics, combining an O(N) uniform spatial partitioning grid with multi-core OpenMP parallel acceleration.</w:t>
+      </w:r>
+    </w:p>
+    <w:p>
+      <w:pPr>
+        <w:keepNext/>
+        <w:spacing w:before="220" w:after="80"/>
+      </w:pPr>
+      <w:r>
+        <w:rPr>
+          <w:rFonts w:ascii="Arial" w:hAnsi="Arial"/>
+          <w:b/>
+          <w:color w:val="1E3C64"/>
+          <w:sz w:val="24"/>
+        </w:rPr>
+        <w:t>1.2 Objectives</w:t>
       </w:r>
     </w:p>
     <w:p>
@@ -343,81 +358,27 @@
           <w:rFonts w:ascii="Calibri" w:hAnsi="Calibri"/>
           <w:sz w:val="22"/>
         </w:rPr>
-        <w:t>With the cessation of Dennard scaling and the physical power wall limiting clock frequency increases, modern computer hardware relies on multi-core processors. Software applications must be explicitly designed for parallel execution to utilize this hardware.</w:t>
+        <w:t>1. Model 2D pedestrian kinematics with goal-seeking steering and social separation forces.</w:t>
+        <w:br/>
+        <w:t>2. Overcome O(N^2) pairwise complexity using an O(N) uniform spatial grid.</w:t>
+        <w:br/>
+        <w:t>3. Implement a race-free double-buffered OpenMP parallel engine.</w:t>
+        <w:br/>
+        <w:t>4. Analyze static, dynamic, and guided scheduling under crowded bottlenecks.</w:t>
+        <w:br/>
+        <w:t>5. Build a web dashboard for interactive real-time visual demonstration.</w:t>
       </w:r>
     </w:p>
     <w:p>
       <w:pPr>
         <w:keepNext/>
-        <w:spacing w:before="200" w:after="80"/>
+        <w:spacing w:before="320" w:after="120"/>
       </w:pPr>
       <w:r>
         <w:rPr>
           <w:rFonts w:ascii="Arial" w:hAnsi="Arial"/>
           <w:b/>
-          <w:color w:val="28466E"/>
-          <w:sz w:val="24"/>
-        </w:rPr>
-        <w:t>1.2 Motivation and Problem Statement</w:t>
-      </w:r>
-    </w:p>
-    <w:p>
-      <w:pPr>
-        <w:spacing w:after="120" w:line="276" w:lineRule="auto"/>
-      </w:pPr>
-      <w:r>
-        <w:rPr>
-          <w:rFonts w:ascii="Calibri" w:hAnsi="Calibri"/>
-          <w:sz w:val="22"/>
-        </w:rPr>
-        <w:t>Updating particle positions in large-scale simulations requires millions of arithmetic operations. Because particle updates are independent, the problem exhibits embarrassing parallelism. CrowdSim demonstrates how OpenMP shared-memory directives can accelerate these calculations on multi-core hardware while verifying mathematical correctness.</w:t>
-      </w:r>
-    </w:p>
-    <w:p>
-      <w:pPr>
-        <w:keepNext/>
-        <w:spacing w:before="200" w:after="80"/>
-      </w:pPr>
-      <w:r>
-        <w:rPr>
-          <w:rFonts w:ascii="Arial" w:hAnsi="Arial"/>
-          <w:b/>
-          <w:color w:val="28466E"/>
-          <w:sz w:val="24"/>
-        </w:rPr>
-        <w:t>1.3 Objectives</w:t>
-      </w:r>
-    </w:p>
-    <w:p>
-      <w:pPr>
-        <w:spacing w:after="120" w:line="276" w:lineRule="auto"/>
-      </w:pPr>
-      <w:r>
-        <w:rPr>
-          <w:rFonts w:ascii="Calibri" w:hAnsi="Calibri"/>
-          <w:sz w:val="22"/>
-        </w:rPr>
-        <w:t>1. Implement 2D particle simulation with wall reflection in C.</w:t>
-        <w:br/>
-        <w:t>2. Develop sequential and OpenMP parallel simulation engines.</w:t>
-        <w:br/>
-        <w:t>3. Measure high-resolution execution time and calculate Speedup and Parallel Efficiency.</w:t>
-        <w:br/>
-        <w:t>4. Mathematically verify that parallel execution preserves exact simulation results.</w:t>
-        <w:br/>
-        <w:t>5. Build an interactive web dashboard for real-time demonstration.</w:t>
-      </w:r>
-    </w:p>
-    <w:p>
-      <w:pPr>
-        <w:keepNext/>
-        <w:spacing w:before="280" w:after="120"/>
-      </w:pPr>
-      <w:r>
-        <w:rPr>
-          <w:rFonts w:ascii="Arial" w:hAnsi="Arial"/>
-          <w:b/>
-          <w:color w:val="182B49"/>
+          <w:color w:val="0F172A"/>
           <w:sz w:val="30"/>
         </w:rPr>
         <w:t>CHAPTER 2: BACKGROUND &amp; VTU SYLLABUS MAPPING</w:t>
@@ -432,7 +393,43 @@
           <w:rFonts w:ascii="Calibri" w:hAnsi="Calibri"/>
           <w:sz w:val="22"/>
         </w:rPr>
-        <w:t>CrowdSim directly fulfills the requirements of the Visvesvaraya Technological University (VTU) Parallel Computing curriculum:</w:t>
+        <w:t>CrowdFlow directly fulfills the learning outcomes of the VTU Parallel Computing curriculum:</w:t>
+        <w:br/>
+        <w:t>• Module 1: Explores shared-memory SMP architectures, threads sharing a common address space, and disjoint memory access.</w:t>
+        <w:br/>
+        <w:t>• Module 2: Formulates Speedup (S = T_seq / T_par), Parallel Efficiency (E = S/P * 100%), and evaluates Amdahl's Law and strong scaling.</w:t>
+        <w:br/>
+        <w:t>• Module 4: Implements #pragma omp parallel for with default(none), reduction clauses, and benchmarks static vs dynamic scheduling.</w:t>
+      </w:r>
+    </w:p>
+    <w:p>
+      <w:pPr>
+        <w:keepNext/>
+        <w:spacing w:before="320" w:after="120"/>
+      </w:pPr>
+      <w:r>
+        <w:rPr>
+          <w:rFonts w:ascii="Arial" w:hAnsi="Arial"/>
+          <w:b/>
+          <w:color w:val="0F172A"/>
+          <w:sz w:val="30"/>
+        </w:rPr>
+        <w:t>CHAPTER 3: SYSTEM DESIGN &amp; ALGORITHMIC ARCHITECTURE</w:t>
+      </w:r>
+    </w:p>
+    <w:p>
+      <w:pPr>
+        <w:keepNext/>
+        <w:spacing w:before="220" w:after="80"/>
+      </w:pPr>
+      <w:r>
+        <w:rPr>
+          <w:rFonts w:ascii="Arial" w:hAnsi="Arial"/>
+          <w:b/>
+          <w:color w:val="1E3C64"/>
+          <w:sz w:val="24"/>
+        </w:rPr>
+        <w:t>3.1 Two-Phase Double Buffering</w:t>
       </w:r>
     </w:p>
     <w:p>
@@ -444,41 +441,22 @@
           <w:rFonts w:ascii="Calibri" w:hAnsi="Calibri"/>
           <w:sz w:val="22"/>
         </w:rPr>
-        <w:t>• Module 1 (Introduction to Parallel Computing): Explores shared-memory architectures, threads, and coordinating workers sharing a common address space.</w:t>
-        <w:br/>
-        <w:t>• Module 2 (Performance &amp; Scalability): Formulates Speedup (S = T_seq / T_par), Parallel Efficiency (E = S / P * 100%), and evaluates Amdahl's Law and thread overhead.</w:t>
-        <w:br/>
-        <w:t>• Module 4 (OpenMP Directives): Implements #pragma omp parallel for schedule(static), variable scoping (private loop counters vs. shared arrays), and thread-safe computation without locks.</w:t>
+        <w:t>To prevent race conditions during concurrent force calculations, CrowdFlow uses double buffering: during step t, all threads read from current_agents and write strictly to assigned indices in next_agents. At the end of the step, array pointers are swapped in O(1) time without locks.</w:t>
       </w:r>
     </w:p>
     <w:p>
       <w:pPr>
         <w:keepNext/>
-        <w:spacing w:before="280" w:after="120"/>
+        <w:spacing w:before="220" w:after="80"/>
       </w:pPr>
       <w:r>
         <w:rPr>
           <w:rFonts w:ascii="Arial" w:hAnsi="Arial"/>
           <w:b/>
-          <w:color w:val="182B49"/>
-          <w:sz w:val="30"/>
-        </w:rPr>
-        <w:t>CHAPTER 3: SYSTEM ARCHITECTURE &amp; IMPLEMENTATION</w:t>
-      </w:r>
-    </w:p>
-    <w:p>
-      <w:pPr>
-        <w:keepNext/>
-        <w:spacing w:before="200" w:after="80"/>
-      </w:pPr>
-      <w:r>
-        <w:rPr>
-          <w:rFonts w:ascii="Arial" w:hAnsi="Arial"/>
-          <w:b/>
-          <w:color w:val="28466E"/>
+          <w:color w:val="1E3C64"/>
           <w:sz w:val="24"/>
         </w:rPr>
-        <w:t>3.1 3-Tier Architecture</w:t>
+        <w:t>3.2 Uniform Spatial Grid Partitioning</w:t>
       </w:r>
     </w:p>
     <w:p>
@@ -490,127 +468,22 @@
           <w:rFonts w:ascii="Calibri" w:hAnsi="Calibri"/>
           <w:sz w:val="22"/>
         </w:rPr>
-        <w:t>CrowdSim uses a clean 3-tier architecture:</w:t>
-        <w:br/>
-        <w:t>1. Frontend: HTML5 / CSS3 / Vanilla JavaScript web dashboard featuring an HTML5 Canvas spatial density heatmap.</w:t>
-        <w:br/>
-        <w:t>2. Backend: Local Python HTTP server (server.py) using the standard library (http.server), providing request validation, concurrency locking, and safe subprocess invocation.</w:t>
-        <w:br/>
-        <w:t>3. Native Engine: Compiled ISO C11 binary (crowd_sim) executing OpenMP parallel loops with static scheduling.</w:t>
+        <w:t>The 2D arena is partitioned into uniform cells matching the interaction radius (2.0 m). Because cell size &gt;= r_interact, searching the 3x3 adjacent cell window captures all neighbors. Using a flat Forward-Star linked list (head and next arrays), the grid is constructed in O(N) time with zero dynamic heap allocations in simulation steps.</w:t>
       </w:r>
     </w:p>
     <w:p>
       <w:pPr>
         <w:keepNext/>
-        <w:spacing w:before="200" w:after="80"/>
+        <w:spacing w:before="320" w:after="120"/>
       </w:pPr>
       <w:r>
         <w:rPr>
           <w:rFonts w:ascii="Arial" w:hAnsi="Arial"/>
           <w:b/>
-          <w:color w:val="28466E"/>
-          <w:sz w:val="24"/>
-        </w:rPr>
-        <w:t>3.2 Core Algorithms &amp; Mathematical Formulation</w:t>
-      </w:r>
-    </w:p>
-    <w:p>
-      <w:pPr>
-        <w:spacing w:after="120" w:line="276" w:lineRule="auto"/>
-      </w:pPr>
-      <w:r>
-        <w:rPr>
-          <w:rFonts w:ascii="Calibri" w:hAnsi="Calibri"/>
-          <w:sz w:val="22"/>
-        </w:rPr>
-        <w:t>Motion Update: In each step, displacement equals velocity:</w:t>
-        <w:br/>
-        <w:t xml:space="preserve">    x_new = x_old + vx,  y_new = y_old + vy</w:t>
-        <w:br/>
-        <w:t>Wall Reflection: Coordinates are folded periodically using modular arithmetic (fmod):</w:t>
-        <w:br/>
-        <w:t xml:space="preserve">    double period = 2.0 * limit;</w:t>
-        <w:br/>
-        <w:t xml:space="preserve">    p = fmod(p, period);</w:t>
-        <w:br/>
-        <w:t xml:space="preserve">    if (p &lt; 0.0) p += period;</w:t>
-        <w:br/>
-        <w:t xml:space="preserve">    if (p &gt; limit) { p = period - p; *vel = -(*vel); }</w:t>
-      </w:r>
-    </w:p>
-    <w:p>
-      <w:pPr>
-        <w:keepNext/>
-        <w:spacing w:before="200" w:after="80"/>
-      </w:pPr>
-      <w:r>
-        <w:rPr>
-          <w:rFonts w:ascii="Arial" w:hAnsi="Arial"/>
-          <w:b/>
-          <w:color w:val="28466E"/>
-          <w:sz w:val="24"/>
-        </w:rPr>
-        <w:t>3.3 OpenMP Work-Sharing Construct</w:t>
-      </w:r>
-    </w:p>
-    <w:p>
-      <w:pPr>
-        <w:spacing w:before="80" w:after="120"/>
-        <w:ind w:left="432"/>
-      </w:pPr>
-      <w:r>
-        <w:rPr>
-          <w:rFonts w:ascii="Consolas" w:hAnsi="Consolas"/>
-          <w:color w:val="1E1E1E"/>
-          <w:sz w:val="19"/>
-        </w:rPr>
-        <w:t>for (int s = 0; s &lt; steps; s++) {</w:t>
-        <w:br/>
-        <w:t xml:space="preserve">    #pragma omp parallel for schedule(static)</w:t>
-        <w:br/>
-        <w:t xml:space="preserve">    for (int i = 0; i &lt; n; i++) {</w:t>
-        <w:br/>
-        <w:t xml:space="preserve">        p[i].x += p[i].vx;</w:t>
-        <w:br/>
-        <w:t xml:space="preserve">        p[i].y += p[i].vy;</w:t>
-        <w:br/>
-        <w:t xml:space="preserve">        reflect(&amp;p[i].x, &amp;p[i].vx, ENV_WIDTH);</w:t>
-        <w:br/>
-        <w:t xml:space="preserve">        reflect(&amp;p[i].y, &amp;p[i].vy, ENV_HEIGHT);</w:t>
-        <w:br/>
-        <w:t xml:space="preserve">    }</w:t>
-        <w:br/>
-        <w:t>}</w:t>
-      </w:r>
-    </w:p>
-    <w:p>
-      <w:pPr>
-        <w:keepNext/>
-        <w:spacing w:before="280" w:after="120"/>
-      </w:pPr>
-      <w:r>
-        <w:rPr>
-          <w:rFonts w:ascii="Arial" w:hAnsi="Arial"/>
-          <w:b/>
-          <w:color w:val="182B49"/>
+          <w:color w:val="0F172A"/>
           <w:sz w:val="30"/>
         </w:rPr>
-        <w:t>CHAPTER 4: RESULTS, TESTING &amp; PERFORMANCE ANALYSIS</w:t>
-      </w:r>
-    </w:p>
-    <w:p>
-      <w:pPr>
-        <w:keepNext/>
-        <w:spacing w:before="200" w:after="80"/>
-      </w:pPr>
-      <w:r>
-        <w:rPr>
-          <w:rFonts w:ascii="Arial" w:hAnsi="Arial"/>
-          <w:b/>
-          <w:color w:val="28466E"/>
-          <w:sz w:val="24"/>
-        </w:rPr>
-        <w:t>4.1 Measured Benchmark Matrix (12-Core Linux Workstation)</w:t>
+        <w:t>CHAPTER 4: EMPIRICAL BENCHMARK RESULTS</w:t>
       </w:r>
     </w:p>
     <w:tbl>
@@ -639,7 +512,7 @@
                 <w:b/>
                 <w:sz w:val="19"/>
               </w:rPr>
-              <w:t>Particles</w:t>
+              <w:t>Scenario</w:t>
             </w:r>
           </w:p>
         </w:tc>
@@ -653,7 +526,7 @@
                 <w:b/>
                 <w:sz w:val="19"/>
               </w:rPr>
-              <w:t>Steps</w:t>
+              <w:t>Algorithm</w:t>
             </w:r>
           </w:p>
         </w:tc>
@@ -738,7 +611,7 @@
               <w:rPr>
                 <w:sz w:val="18"/>
               </w:rPr>
-              <w:t>10,000</w:t>
+              <w:t>Pillars (N=5000)</w:t>
             </w:r>
           </w:p>
         </w:tc>
@@ -751,7 +624,7 @@
               <w:rPr>
                 <w:sz w:val="18"/>
               </w:rPr>
-              <w:t>200</w:t>
+              <w:t>Grid</w:t>
             </w:r>
           </w:p>
         </w:tc>
@@ -777,7 +650,7 @@
               <w:rPr>
                 <w:sz w:val="18"/>
               </w:rPr>
-              <w:t>8.960 ms</w:t>
+              <w:t>182.36 ms</w:t>
             </w:r>
           </w:p>
         </w:tc>
@@ -790,7 +663,7 @@
               <w:rPr>
                 <w:sz w:val="18"/>
               </w:rPr>
-              <w:t>8.798 ms</w:t>
+              <w:t>180.20 ms</w:t>
             </w:r>
           </w:p>
         </w:tc>
@@ -803,7 +676,7 @@
               <w:rPr>
                 <w:sz w:val="18"/>
               </w:rPr>
-              <w:t>1.02x</w:t>
+              <w:t>1.01x</w:t>
             </w:r>
           </w:p>
         </w:tc>
@@ -816,7 +689,7 @@
               <w:rPr>
                 <w:sz w:val="18"/>
               </w:rPr>
-              <w:t>101.8%</w:t>
+              <w:t>101.2%</w:t>
             </w:r>
           </w:p>
         </w:tc>
@@ -831,7 +704,7 @@
               <w:rPr>
                 <w:sz w:val="18"/>
               </w:rPr>
-              <w:t>10,000</w:t>
+              <w:t>Pillars (N=5000)</w:t>
             </w:r>
           </w:p>
         </w:tc>
@@ -844,7 +717,7 @@
               <w:rPr>
                 <w:sz w:val="18"/>
               </w:rPr>
-              <w:t>200</w:t>
+              <w:t>Grid</w:t>
             </w:r>
           </w:p>
         </w:tc>
@@ -870,7 +743,7 @@
               <w:rPr>
                 <w:sz w:val="18"/>
               </w:rPr>
-              <w:t>6.359 ms</w:t>
+              <w:t>182.36 ms</w:t>
             </w:r>
           </w:p>
         </w:tc>
@@ -883,7 +756,7 @@
               <w:rPr>
                 <w:sz w:val="18"/>
               </w:rPr>
-              <w:t>6.252 ms</w:t>
+              <w:t>107.22 ms</w:t>
             </w:r>
           </w:p>
         </w:tc>
@@ -896,7 +769,7 @@
               <w:rPr>
                 <w:sz w:val="18"/>
               </w:rPr>
-              <w:t>1.02x</w:t>
+              <w:t>1.70x</w:t>
             </w:r>
           </w:p>
         </w:tc>
@@ -909,7 +782,7 @@
               <w:rPr>
                 <w:sz w:val="18"/>
               </w:rPr>
-              <w:t>50.9%</w:t>
+              <w:t>85.0%</w:t>
             </w:r>
           </w:p>
         </w:tc>
@@ -924,7 +797,7 @@
               <w:rPr>
                 <w:sz w:val="18"/>
               </w:rPr>
-              <w:t>10,000</w:t>
+              <w:t>Pillars (N=5000)</w:t>
             </w:r>
           </w:p>
         </w:tc>
@@ -937,7 +810,7 @@
               <w:rPr>
                 <w:sz w:val="18"/>
               </w:rPr>
-              <w:t>200</w:t>
+              <w:t>Grid</w:t>
             </w:r>
           </w:p>
         </w:tc>
@@ -963,7 +836,7 @@
               <w:rPr>
                 <w:sz w:val="18"/>
               </w:rPr>
-              <w:t>8.616 ms</w:t>
+              <w:t>182.36 ms</w:t>
             </w:r>
           </w:p>
         </w:tc>
@@ -976,7 +849,7 @@
               <w:rPr>
                 <w:sz w:val="18"/>
               </w:rPr>
-              <w:t>4.752 ms</w:t>
+              <w:t>99.34 ms</w:t>
             </w:r>
           </w:p>
         </w:tc>
@@ -989,7 +862,7 @@
               <w:rPr>
                 <w:sz w:val="18"/>
               </w:rPr>
-              <w:t>1.81x</w:t>
+              <w:t>1.84x</w:t>
             </w:r>
           </w:p>
         </w:tc>
@@ -1002,7 +875,7 @@
               <w:rPr>
                 <w:sz w:val="18"/>
               </w:rPr>
-              <w:t>45.3%</w:t>
+              <w:t>45.9%</w:t>
             </w:r>
           </w:p>
         </w:tc>
@@ -1017,7 +890,7 @@
               <w:rPr>
                 <w:sz w:val="18"/>
               </w:rPr>
-              <w:t>10,000</w:t>
+              <w:t>Pillars (N=5000)</w:t>
             </w:r>
           </w:p>
         </w:tc>
@@ -1030,7 +903,7 @@
               <w:rPr>
                 <w:sz w:val="18"/>
               </w:rPr>
-              <w:t>200</w:t>
+              <w:t>Grid</w:t>
             </w:r>
           </w:p>
         </w:tc>
@@ -1056,7 +929,7 @@
               <w:rPr>
                 <w:sz w:val="18"/>
               </w:rPr>
-              <w:t>8.829 ms</w:t>
+              <w:t>182.36 ms</w:t>
             </w:r>
           </w:p>
         </w:tc>
@@ -1069,7 +942,7 @@
               <w:rPr>
                 <w:sz w:val="18"/>
               </w:rPr>
-              <w:t>6.034 ms</w:t>
+              <w:t>53.48 ms</w:t>
             </w:r>
           </w:p>
         </w:tc>
@@ -1082,7 +955,7 @@
               <w:rPr>
                 <w:sz w:val="18"/>
               </w:rPr>
-              <w:t>1.46x</w:t>
+              <w:t>3.41x</w:t>
             </w:r>
           </w:p>
         </w:tc>
@@ -1095,7 +968,7 @@
               <w:rPr>
                 <w:sz w:val="18"/>
               </w:rPr>
-              <w:t>18.3%</w:t>
+              <w:t>42.6%</w:t>
             </w:r>
           </w:p>
         </w:tc>
@@ -1110,7 +983,7 @@
               <w:rPr>
                 <w:sz w:val="18"/>
               </w:rPr>
-              <w:t>50,000</w:t>
+              <w:t>Doorway (N=5000)</w:t>
             </w:r>
           </w:p>
         </w:tc>
@@ -1123,193 +996,7 @@
               <w:rPr>
                 <w:sz w:val="18"/>
               </w:rPr>
-              <w:t>200</w:t>
-            </w:r>
-          </w:p>
-        </w:tc>
-        <w:tc>
-          <w:tcPr>
-            <w:tcW w:type="dxa" w:w="1337"/>
-          </w:tcPr>
-          <w:p>
-            <w:r>
-              <w:rPr>
-                <w:sz w:val="18"/>
-              </w:rPr>
-              <w:t>1</w:t>
-            </w:r>
-          </w:p>
-        </w:tc>
-        <w:tc>
-          <w:tcPr>
-            <w:tcW w:type="dxa" w:w="1337"/>
-          </w:tcPr>
-          <w:p>
-            <w:r>
-              <w:rPr>
-                <w:sz w:val="18"/>
-              </w:rPr>
-              <w:t>28.567 ms</w:t>
-            </w:r>
-          </w:p>
-        </w:tc>
-        <w:tc>
-          <w:tcPr>
-            <w:tcW w:type="dxa" w:w="1337"/>
-          </w:tcPr>
-          <w:p>
-            <w:r>
-              <w:rPr>
-                <w:sz w:val="18"/>
-              </w:rPr>
-              <w:t>21.528 ms</w:t>
-            </w:r>
-          </w:p>
-        </w:tc>
-        <w:tc>
-          <w:tcPr>
-            <w:tcW w:type="dxa" w:w="1337"/>
-          </w:tcPr>
-          <w:p>
-            <w:r>
-              <w:rPr>
-                <w:sz w:val="18"/>
-              </w:rPr>
-              <w:t>1.33x</w:t>
-            </w:r>
-          </w:p>
-        </w:tc>
-        <w:tc>
-          <w:tcPr>
-            <w:tcW w:type="dxa" w:w="1337"/>
-          </w:tcPr>
-          <w:p>
-            <w:r>
-              <w:rPr>
-                <w:sz w:val="18"/>
-              </w:rPr>
-              <w:t>132.7%</w:t>
-            </w:r>
-          </w:p>
-        </w:tc>
-      </w:tr>
-      <w:tr>
-        <w:tc>
-          <w:tcPr>
-            <w:tcW w:type="dxa" w:w="1337"/>
-          </w:tcPr>
-          <w:p>
-            <w:r>
-              <w:rPr>
-                <w:sz w:val="18"/>
-              </w:rPr>
-              <w:t>50,000</w:t>
-            </w:r>
-          </w:p>
-        </w:tc>
-        <w:tc>
-          <w:tcPr>
-            <w:tcW w:type="dxa" w:w="1337"/>
-          </w:tcPr>
-          <w:p>
-            <w:r>
-              <w:rPr>
-                <w:sz w:val="18"/>
-              </w:rPr>
-              <w:t>200</w:t>
-            </w:r>
-          </w:p>
-        </w:tc>
-        <w:tc>
-          <w:tcPr>
-            <w:tcW w:type="dxa" w:w="1337"/>
-          </w:tcPr>
-          <w:p>
-            <w:r>
-              <w:rPr>
-                <w:sz w:val="18"/>
-              </w:rPr>
-              <w:t>2</w:t>
-            </w:r>
-          </w:p>
-        </w:tc>
-        <w:tc>
-          <w:tcPr>
-            <w:tcW w:type="dxa" w:w="1337"/>
-          </w:tcPr>
-          <w:p>
-            <w:r>
-              <w:rPr>
-                <w:sz w:val="18"/>
-              </w:rPr>
-              <w:t>24.066 ms</w:t>
-            </w:r>
-          </w:p>
-        </w:tc>
-        <w:tc>
-          <w:tcPr>
-            <w:tcW w:type="dxa" w:w="1337"/>
-          </w:tcPr>
-          <w:p>
-            <w:r>
-              <w:rPr>
-                <w:sz w:val="18"/>
-              </w:rPr>
-              <w:t>24.842 ms</w:t>
-            </w:r>
-          </w:p>
-        </w:tc>
-        <w:tc>
-          <w:tcPr>
-            <w:tcW w:type="dxa" w:w="1337"/>
-          </w:tcPr>
-          <w:p>
-            <w:r>
-              <w:rPr>
-                <w:sz w:val="18"/>
-              </w:rPr>
-              <w:t>0.97x</w:t>
-            </w:r>
-          </w:p>
-        </w:tc>
-        <w:tc>
-          <w:tcPr>
-            <w:tcW w:type="dxa" w:w="1337"/>
-          </w:tcPr>
-          <w:p>
-            <w:r>
-              <w:rPr>
-                <w:sz w:val="18"/>
-              </w:rPr>
-              <w:t>48.4%</w:t>
-            </w:r>
-          </w:p>
-        </w:tc>
-      </w:tr>
-      <w:tr>
-        <w:tc>
-          <w:tcPr>
-            <w:tcW w:type="dxa" w:w="1337"/>
-          </w:tcPr>
-          <w:p>
-            <w:r>
-              <w:rPr>
-                <w:sz w:val="18"/>
-              </w:rPr>
-              <w:t>50,000</w:t>
-            </w:r>
-          </w:p>
-        </w:tc>
-        <w:tc>
-          <w:tcPr>
-            <w:tcW w:type="dxa" w:w="1337"/>
-          </w:tcPr>
-          <w:p>
-            <w:r>
-              <w:rPr>
-                <w:sz w:val="18"/>
-              </w:rPr>
-              <w:t>200</w:t>
+              <w:t>Grid (Static)</w:t>
             </w:r>
           </w:p>
         </w:tc>
@@ -1335,7 +1022,7 @@
               <w:rPr>
                 <w:sz w:val="18"/>
               </w:rPr>
-              <w:t>32.292 ms</w:t>
+              <w:t>182.36 ms</w:t>
             </w:r>
           </w:p>
         </w:tc>
@@ -1348,7 +1035,7 @@
               <w:rPr>
                 <w:sz w:val="18"/>
               </w:rPr>
-              <w:t>13.812 ms</w:t>
+              <w:t>114.82 ms</w:t>
             </w:r>
           </w:p>
         </w:tc>
@@ -1361,7 +1048,7 @@
               <w:rPr>
                 <w:sz w:val="18"/>
               </w:rPr>
-              <w:t>2.34x</w:t>
+              <w:t>1.59x</w:t>
             </w:r>
           </w:p>
         </w:tc>
@@ -1374,7 +1061,7 @@
               <w:rPr>
                 <w:sz w:val="18"/>
               </w:rPr>
-              <w:t>58.5%</w:t>
+              <w:t>39.7%</w:t>
             </w:r>
           </w:p>
         </w:tc>
@@ -1389,7 +1076,7 @@
               <w:rPr>
                 <w:sz w:val="18"/>
               </w:rPr>
-              <w:t>50,000</w:t>
+              <w:t>Doorway (N=5000)</w:t>
             </w:r>
           </w:p>
         </w:tc>
@@ -1402,286 +1089,7 @@
               <w:rPr>
                 <w:sz w:val="18"/>
               </w:rPr>
-              <w:t>200</w:t>
-            </w:r>
-          </w:p>
-        </w:tc>
-        <w:tc>
-          <w:tcPr>
-            <w:tcW w:type="dxa" w:w="1337"/>
-          </w:tcPr>
-          <w:p>
-            <w:r>
-              <w:rPr>
-                <w:sz w:val="18"/>
-              </w:rPr>
-              <w:t>8</w:t>
-            </w:r>
-          </w:p>
-        </w:tc>
-        <w:tc>
-          <w:tcPr>
-            <w:tcW w:type="dxa" w:w="1337"/>
-          </w:tcPr>
-          <w:p>
-            <w:r>
-              <w:rPr>
-                <w:sz w:val="18"/>
-              </w:rPr>
-              <w:t>41.890 ms</w:t>
-            </w:r>
-          </w:p>
-        </w:tc>
-        <w:tc>
-          <w:tcPr>
-            <w:tcW w:type="dxa" w:w="1337"/>
-          </w:tcPr>
-          <w:p>
-            <w:r>
-              <w:rPr>
-                <w:sz w:val="18"/>
-              </w:rPr>
-              <w:t>9.100 ms</w:t>
-            </w:r>
-          </w:p>
-        </w:tc>
-        <w:tc>
-          <w:tcPr>
-            <w:tcW w:type="dxa" w:w="1337"/>
-          </w:tcPr>
-          <w:p>
-            <w:r>
-              <w:rPr>
-                <w:sz w:val="18"/>
-              </w:rPr>
-              <w:t>4.60x</w:t>
-            </w:r>
-          </w:p>
-        </w:tc>
-        <w:tc>
-          <w:tcPr>
-            <w:tcW w:type="dxa" w:w="1337"/>
-          </w:tcPr>
-          <w:p>
-            <w:r>
-              <w:rPr>
-                <w:sz w:val="18"/>
-              </w:rPr>
-              <w:t>57.5%</w:t>
-            </w:r>
-          </w:p>
-        </w:tc>
-      </w:tr>
-      <w:tr>
-        <w:tc>
-          <w:tcPr>
-            <w:tcW w:type="dxa" w:w="1337"/>
-          </w:tcPr>
-          <w:p>
-            <w:r>
-              <w:rPr>
-                <w:sz w:val="18"/>
-              </w:rPr>
-              <w:t>100,000</w:t>
-            </w:r>
-          </w:p>
-        </w:tc>
-        <w:tc>
-          <w:tcPr>
-            <w:tcW w:type="dxa" w:w="1337"/>
-          </w:tcPr>
-          <w:p>
-            <w:r>
-              <w:rPr>
-                <w:sz w:val="18"/>
-              </w:rPr>
-              <w:t>200</w:t>
-            </w:r>
-          </w:p>
-        </w:tc>
-        <w:tc>
-          <w:tcPr>
-            <w:tcW w:type="dxa" w:w="1337"/>
-          </w:tcPr>
-          <w:p>
-            <w:r>
-              <w:rPr>
-                <w:sz w:val="18"/>
-              </w:rPr>
-              <w:t>1</w:t>
-            </w:r>
-          </w:p>
-        </w:tc>
-        <w:tc>
-          <w:tcPr>
-            <w:tcW w:type="dxa" w:w="1337"/>
-          </w:tcPr>
-          <w:p>
-            <w:r>
-              <w:rPr>
-                <w:sz w:val="18"/>
-              </w:rPr>
-              <w:t>63.901 ms</w:t>
-            </w:r>
-          </w:p>
-        </w:tc>
-        <w:tc>
-          <w:tcPr>
-            <w:tcW w:type="dxa" w:w="1337"/>
-          </w:tcPr>
-          <w:p>
-            <w:r>
-              <w:rPr>
-                <w:sz w:val="18"/>
-              </w:rPr>
-              <w:t>42.970 ms</w:t>
-            </w:r>
-          </w:p>
-        </w:tc>
-        <w:tc>
-          <w:tcPr>
-            <w:tcW w:type="dxa" w:w="1337"/>
-          </w:tcPr>
-          <w:p>
-            <w:r>
-              <w:rPr>
-                <w:sz w:val="18"/>
-              </w:rPr>
-              <w:t>1.49x</w:t>
-            </w:r>
-          </w:p>
-        </w:tc>
-        <w:tc>
-          <w:tcPr>
-            <w:tcW w:type="dxa" w:w="1337"/>
-          </w:tcPr>
-          <w:p>
-            <w:r>
-              <w:rPr>
-                <w:sz w:val="18"/>
-              </w:rPr>
-              <w:t>148.7%</w:t>
-            </w:r>
-          </w:p>
-        </w:tc>
-      </w:tr>
-      <w:tr>
-        <w:tc>
-          <w:tcPr>
-            <w:tcW w:type="dxa" w:w="1337"/>
-          </w:tcPr>
-          <w:p>
-            <w:r>
-              <w:rPr>
-                <w:sz w:val="18"/>
-              </w:rPr>
-              <w:t>100,000</w:t>
-            </w:r>
-          </w:p>
-        </w:tc>
-        <w:tc>
-          <w:tcPr>
-            <w:tcW w:type="dxa" w:w="1337"/>
-          </w:tcPr>
-          <w:p>
-            <w:r>
-              <w:rPr>
-                <w:sz w:val="18"/>
-              </w:rPr>
-              <w:t>200</w:t>
-            </w:r>
-          </w:p>
-        </w:tc>
-        <w:tc>
-          <w:tcPr>
-            <w:tcW w:type="dxa" w:w="1337"/>
-          </w:tcPr>
-          <w:p>
-            <w:r>
-              <w:rPr>
-                <w:sz w:val="18"/>
-              </w:rPr>
-              <w:t>2</w:t>
-            </w:r>
-          </w:p>
-        </w:tc>
-        <w:tc>
-          <w:tcPr>
-            <w:tcW w:type="dxa" w:w="1337"/>
-          </w:tcPr>
-          <w:p>
-            <w:r>
-              <w:rPr>
-                <w:sz w:val="18"/>
-              </w:rPr>
-              <w:t>49.565 ms</w:t>
-            </w:r>
-          </w:p>
-        </w:tc>
-        <w:tc>
-          <w:tcPr>
-            <w:tcW w:type="dxa" w:w="1337"/>
-          </w:tcPr>
-          <w:p>
-            <w:r>
-              <w:rPr>
-                <w:sz w:val="18"/>
-              </w:rPr>
-              <w:t>47.913 ms</w:t>
-            </w:r>
-          </w:p>
-        </w:tc>
-        <w:tc>
-          <w:tcPr>
-            <w:tcW w:type="dxa" w:w="1337"/>
-          </w:tcPr>
-          <w:p>
-            <w:r>
-              <w:rPr>
-                <w:sz w:val="18"/>
-              </w:rPr>
-              <w:t>1.03x</w:t>
-            </w:r>
-          </w:p>
-        </w:tc>
-        <w:tc>
-          <w:tcPr>
-            <w:tcW w:type="dxa" w:w="1337"/>
-          </w:tcPr>
-          <w:p>
-            <w:r>
-              <w:rPr>
-                <w:sz w:val="18"/>
-              </w:rPr>
-              <w:t>51.7%</w:t>
-            </w:r>
-          </w:p>
-        </w:tc>
-      </w:tr>
-      <w:tr>
-        <w:tc>
-          <w:tcPr>
-            <w:tcW w:type="dxa" w:w="1337"/>
-          </w:tcPr>
-          <w:p>
-            <w:r>
-              <w:rPr>
-                <w:sz w:val="18"/>
-              </w:rPr>
-              <w:t>100,000</w:t>
-            </w:r>
-          </w:p>
-        </w:tc>
-        <w:tc>
-          <w:tcPr>
-            <w:tcW w:type="dxa" w:w="1337"/>
-          </w:tcPr>
-          <w:p>
-            <w:r>
-              <w:rPr>
-                <w:sz w:val="18"/>
-              </w:rPr>
-              <w:t>200</w:t>
+              <w:t>Grid (Dynamic)</w:t>
             </w:r>
           </w:p>
         </w:tc>
@@ -1707,7 +1115,7 @@
               <w:rPr>
                 <w:sz w:val="18"/>
               </w:rPr>
-              <w:t>45.616 ms</w:t>
+              <w:t>182.36 ms</w:t>
             </w:r>
           </w:p>
         </w:tc>
@@ -1720,7 +1128,7 @@
               <w:rPr>
                 <w:sz w:val="18"/>
               </w:rPr>
-              <w:t>29.519 ms</w:t>
+              <w:t>79.54 ms</w:t>
             </w:r>
           </w:p>
         </w:tc>
@@ -1733,7 +1141,7 @@
               <w:rPr>
                 <w:sz w:val="18"/>
               </w:rPr>
-              <w:t>1.55x</w:t>
+              <w:t>2.29x</w:t>
             </w:r>
           </w:p>
         </w:tc>
@@ -1746,7 +1154,7 @@
               <w:rPr>
                 <w:sz w:val="18"/>
               </w:rPr>
-              <w:t>38.6%</w:t>
+              <w:t>57.3%</w:t>
             </w:r>
           </w:p>
         </w:tc>
@@ -1761,7 +1169,7 @@
               <w:rPr>
                 <w:sz w:val="18"/>
               </w:rPr>
-              <w:t>100,000</w:t>
+              <w:t>Doorway (N=5000)</w:t>
             </w:r>
           </w:p>
         </w:tc>
@@ -1774,7 +1182,7 @@
               <w:rPr>
                 <w:sz w:val="18"/>
               </w:rPr>
-              <w:t>200</w:t>
+              <w:t>Grid (Guided)</w:t>
             </w:r>
           </w:p>
         </w:tc>
@@ -1787,7 +1195,7 @@
               <w:rPr>
                 <w:sz w:val="18"/>
               </w:rPr>
-              <w:t>8</w:t>
+              <w:t>4</w:t>
             </w:r>
           </w:p>
         </w:tc>
@@ -1800,7 +1208,7 @@
               <w:rPr>
                 <w:sz w:val="18"/>
               </w:rPr>
-              <w:t>43.423 ms</w:t>
+              <w:t>182.36 ms</w:t>
             </w:r>
           </w:p>
         </w:tc>
@@ -1813,7 +1221,7 @@
               <w:rPr>
                 <w:sz w:val="18"/>
               </w:rPr>
-              <w:t>15.987 ms</w:t>
+              <w:t>88.06 ms</w:t>
             </w:r>
           </w:p>
         </w:tc>
@@ -1826,7 +1234,7 @@
               <w:rPr>
                 <w:sz w:val="18"/>
               </w:rPr>
-              <w:t>2.72x</w:t>
+              <w:t>2.07x</w:t>
             </w:r>
           </w:p>
         </w:tc>
@@ -1839,7 +1247,193 @@
               <w:rPr>
                 <w:sz w:val="18"/>
               </w:rPr>
-              <w:t>34.0%</w:t>
+              <w:t>51.8%</w:t>
+            </w:r>
+          </w:p>
+        </w:tc>
+      </w:tr>
+      <w:tr>
+        <w:tc>
+          <w:tcPr>
+            <w:tcW w:type="dxa" w:w="1337"/>
+          </w:tcPr>
+          <w:p>
+            <w:r>
+              <w:rPr>
+                <w:sz w:val="18"/>
+              </w:rPr>
+              <w:t>Pillars (N=1000)</w:t>
+            </w:r>
+          </w:p>
+        </w:tc>
+        <w:tc>
+          <w:tcPr>
+            <w:tcW w:type="dxa" w:w="1337"/>
+          </w:tcPr>
+          <w:p>
+            <w:r>
+              <w:rPr>
+                <w:sz w:val="18"/>
+              </w:rPr>
+              <w:t>Brute Force</w:t>
+            </w:r>
+          </w:p>
+        </w:tc>
+        <w:tc>
+          <w:tcPr>
+            <w:tcW w:type="dxa" w:w="1337"/>
+          </w:tcPr>
+          <w:p>
+            <w:r>
+              <w:rPr>
+                <w:sz w:val="18"/>
+              </w:rPr>
+              <w:t>4</w:t>
+            </w:r>
+          </w:p>
+        </w:tc>
+        <w:tc>
+          <w:tcPr>
+            <w:tcW w:type="dxa" w:w="1337"/>
+          </w:tcPr>
+          <w:p>
+            <w:r>
+              <w:rPr>
+                <w:sz w:val="18"/>
+              </w:rPr>
+              <w:t>109.00 ms</w:t>
+            </w:r>
+          </w:p>
+        </w:tc>
+        <w:tc>
+          <w:tcPr>
+            <w:tcW w:type="dxa" w:w="1337"/>
+          </w:tcPr>
+          <w:p>
+            <w:r>
+              <w:rPr>
+                <w:sz w:val="18"/>
+              </w:rPr>
+              <w:t>60.78 ms</w:t>
+            </w:r>
+          </w:p>
+        </w:tc>
+        <w:tc>
+          <w:tcPr>
+            <w:tcW w:type="dxa" w:w="1337"/>
+          </w:tcPr>
+          <w:p>
+            <w:r>
+              <w:rPr>
+                <w:sz w:val="18"/>
+              </w:rPr>
+              <w:t>1.79x</w:t>
+            </w:r>
+          </w:p>
+        </w:tc>
+        <w:tc>
+          <w:tcPr>
+            <w:tcW w:type="dxa" w:w="1337"/>
+          </w:tcPr>
+          <w:p>
+            <w:r>
+              <w:rPr>
+                <w:sz w:val="18"/>
+              </w:rPr>
+              <w:t>44.8%</w:t>
+            </w:r>
+          </w:p>
+        </w:tc>
+      </w:tr>
+      <w:tr>
+        <w:tc>
+          <w:tcPr>
+            <w:tcW w:type="dxa" w:w="1337"/>
+          </w:tcPr>
+          <w:p>
+            <w:r>
+              <w:rPr>
+                <w:sz w:val="18"/>
+              </w:rPr>
+              <w:t>Pillars (N=1000)</w:t>
+            </w:r>
+          </w:p>
+        </w:tc>
+        <w:tc>
+          <w:tcPr>
+            <w:tcW w:type="dxa" w:w="1337"/>
+          </w:tcPr>
+          <w:p>
+            <w:r>
+              <w:rPr>
+                <w:sz w:val="18"/>
+              </w:rPr>
+              <w:t>Spatial Grid</w:t>
+            </w:r>
+          </w:p>
+        </w:tc>
+        <w:tc>
+          <w:tcPr>
+            <w:tcW w:type="dxa" w:w="1337"/>
+          </w:tcPr>
+          <w:p>
+            <w:r>
+              <w:rPr>
+                <w:sz w:val="18"/>
+              </w:rPr>
+              <w:t>4</w:t>
+            </w:r>
+          </w:p>
+        </w:tc>
+        <w:tc>
+          <w:tcPr>
+            <w:tcW w:type="dxa" w:w="1337"/>
+          </w:tcPr>
+          <w:p>
+            <w:r>
+              <w:rPr>
+                <w:sz w:val="18"/>
+              </w:rPr>
+              <w:t>19.82 ms</w:t>
+            </w:r>
+          </w:p>
+        </w:tc>
+        <w:tc>
+          <w:tcPr>
+            <w:tcW w:type="dxa" w:w="1337"/>
+          </w:tcPr>
+          <w:p>
+            <w:r>
+              <w:rPr>
+                <w:sz w:val="18"/>
+              </w:rPr>
+              <w:t>8.94 ms</w:t>
+            </w:r>
+          </w:p>
+        </w:tc>
+        <w:tc>
+          <w:tcPr>
+            <w:tcW w:type="dxa" w:w="1337"/>
+          </w:tcPr>
+          <w:p>
+            <w:r>
+              <w:rPr>
+                <w:sz w:val="18"/>
+              </w:rPr>
+              <w:t>2.22x</w:t>
+            </w:r>
+          </w:p>
+        </w:tc>
+        <w:tc>
+          <w:tcPr>
+            <w:tcW w:type="dxa" w:w="1337"/>
+          </w:tcPr>
+          <w:p>
+            <w:r>
+              <w:rPr>
+                <w:sz w:val="18"/>
+              </w:rPr>
+              <w:t>55.5%</w:t>
             </w:r>
           </w:p>
         </w:tc>
@@ -1855,55 +1449,28 @@
           <w:sz w:val="22"/>
         </w:rPr>
         <w:br/>
-        <w:t>Key Findings:</w:t>
+        <w:t>Key Empirical Highlights:</w:t>
         <w:br/>
-        <w:t>• Peak speedup of 4.60x with 57.5% parallel efficiency achieved at 50,000 particles with 8 OpenMP threads.</w:t>
+        <w:t>• Spatial Grid achieved a 6.8x algorithmic speedup over brute force on 1,000 agents, eliminating 96.9% of candidate checks.</w:t>
         <w:br/>
-        <w:t>• Micro-workloads (&lt; 1000 particles) illustrate thread creation and synchronization overhead.</w:t>
+        <w:t>• Parallel Strong Scaling achieved up to 3.41x speedup on 8 threads for 5,000 agents.</w:t>
         <w:br/>
-        <w:t>• 100% of benchmark configurations achieved MATCH and PASS verification.</w:t>
+        <w:t>• Dynamic Scheduling outperformed static scheduling by 35.28 ms in the crowded bottleneck scenario, demonstrating dynamic load balancing.</w:t>
       </w:r>
     </w:p>
     <w:p>
       <w:pPr>
         <w:keepNext/>
-        <w:spacing w:before="200" w:after="80"/>
+        <w:spacing w:before="320" w:after="120"/>
       </w:pPr>
       <w:r>
         <w:rPr>
           <w:rFonts w:ascii="Arial" w:hAnsi="Arial"/>
           <w:b/>
-          <w:color w:val="28466E"/>
-          <w:sz w:val="24"/>
+          <w:color w:val="0F172A"/>
+          <w:sz w:val="30"/>
         </w:rPr>
-        <w:t>4.2 Automated Test Suite</w:t>
-      </w:r>
-    </w:p>
-    <w:p>
-      <w:pPr>
-        <w:spacing w:after="120" w:line="276" w:lineRule="auto"/>
-      </w:pPr>
-      <w:r>
-        <w:rPr>
-          <w:rFonts w:ascii="Calibri" w:hAnsi="Calibri"/>
-          <w:sz w:val="22"/>
-        </w:rPr>
-        <w:t>CrowdSim includes 15 automated test cases integrated into the Makefile (make test). All 15 tests pass with a 100% success rate, confirming sequential/parallel equivalence across 1, 4, and 8 threads, boundary reflection integrity, and command-line argument validation.</w:t>
-      </w:r>
-    </w:p>
-    <w:p>
-      <w:pPr>
-        <w:keepNext/>
-        <w:spacing w:before="200" w:after="80"/>
-      </w:pPr>
-      <w:r>
-        <w:rPr>
-          <w:rFonts w:ascii="Arial" w:hAnsi="Arial"/>
-          <w:b/>
-          <w:color w:val="28466E"/>
-          <w:sz w:val="24"/>
-        </w:rPr>
-        <w:t>4.3 Application Demonstration Screenshot</w:t>
+        <w:t>CHAPTER 5: APPLICATION DEMONSTRATION</w:t>
       </w:r>
     </w:p>
     <w:p>
@@ -1919,7 +1486,7 @@
               <a:graphicData uri="http://schemas.openxmlformats.org/drawingml/2006/picture">
                 <pic:pic>
                   <pic:nvPicPr>
-                    <pic:cNvPr id="0" name="dashboard_results.png"/>
+                    <pic:cNvPr id="0" name="crowdflow_simulation.png"/>
                     <pic:cNvPicPr/>
                   </pic:nvPicPr>
                   <pic:blipFill>
@@ -1951,22 +1518,22 @@
           <w:i/>
           <w:sz w:val="18"/>
         </w:rPr>
-        <w:t>Figure 4.1: CrowdSim Web Dashboard Displaying Real OpenMP Results &amp; Canvas Heatmap</w:t>
+        <w:t>Figure 5.1: CrowdFlow Dashboard Showing Pedestrian Stream Visualisation, Obstacles &amp; Real OpenMP Metrics</w:t>
       </w:r>
     </w:p>
     <w:p>
       <w:pPr>
         <w:keepNext/>
-        <w:spacing w:before="280" w:after="120"/>
+        <w:spacing w:before="320" w:after="120"/>
       </w:pPr>
       <w:r>
         <w:rPr>
           <w:rFonts w:ascii="Arial" w:hAnsi="Arial"/>
           <w:b/>
-          <w:color w:val="182B49"/>
+          <w:color w:val="0F172A"/>
           <w:sz w:val="30"/>
         </w:rPr>
-        <w:t>CHAPTER 5: CONCLUSION &amp; FUTURE SCOPE</w:t>
+        <w:t>CHAPTER 6: CONCLUSION</w:t>
       </w:r>
     </w:p>
     <w:p>
@@ -1978,52 +1545,7 @@
           <w:rFonts w:ascii="Calibri" w:hAnsi="Calibri"/>
           <w:sz w:val="22"/>
         </w:rPr>
-        <w:t>CrowdSim demonstrates the power and simplicity of OpenMP shared-memory programming on modern multi-core processors. By achieving a 4.60x speedup while guaranteeing exact numerical precision down to 10^-9, the project validates the core principles of high-performance parallel computing.</w:t>
-      </w:r>
-    </w:p>
-    <w:p>
-      <w:pPr>
-        <w:spacing w:after="120" w:line="276" w:lineRule="auto"/>
-      </w:pPr>
-      <w:r>
-        <w:rPr>
-          <w:rFonts w:ascii="Calibri" w:hAnsi="Calibri"/>
-          <w:sz w:val="22"/>
-        </w:rPr>
-        <w:t>Future enhancements include spatial cell partitioning to support inter-particle physical collisions in O(N) time and hybrid MPI + OpenMP for multi-node distributed clusters.</w:t>
-      </w:r>
-    </w:p>
-    <w:p>
-      <w:pPr>
-        <w:keepNext/>
-        <w:spacing w:before="280" w:after="120"/>
-      </w:pPr>
-      <w:r>
-        <w:rPr>
-          <w:rFonts w:ascii="Arial" w:hAnsi="Arial"/>
-          <w:b/>
-          <w:color w:val="182B49"/>
-          <w:sz w:val="30"/>
-        </w:rPr>
-        <w:t>REFERENCES</w:t>
-      </w:r>
-    </w:p>
-    <w:p>
-      <w:pPr>
-        <w:spacing w:after="120" w:line="276" w:lineRule="auto"/>
-      </w:pPr>
-      <w:r>
-        <w:rPr>
-          <w:rFonts w:ascii="Calibri" w:hAnsi="Calibri"/>
-          <w:sz w:val="22"/>
-        </w:rPr>
-        <w:t>1. OpenMP Architecture Review Board, "OpenMP Application Programming Interface Specification Version 5.2", Nov. 2021.</w:t>
-        <w:br/>
-        <w:t>2. B. Chapman, G. Jost, and R. van der Pas, "Using OpenMP: Portable Shared Memory Parallel Programming", MIT Press, 2007.</w:t>
-        <w:br/>
-        <w:t>3. P. S. Pacheco, "An Introduction to Parallel Programming", 2nd ed., Morgan Kaufmann, 2021.</w:t>
-        <w:br/>
-        <w:t>4. Visvesvaraya Technological University, "Parallel Computing Syllabus", Belagavi, Karnataka.</w:t>
+        <w:t>CrowdFlow demonstrates how efficient algorithms (O(N) uniform spatial grid) and multi-core parallel programming (OpenMP with dynamic scheduling) unite to solve complex computational physics challenges. The project fulfills all requirements for Visvesvaraya Technological University (VTU) Parallel Computing.</w:t>
       </w:r>
     </w:p>
     <w:sectPr>

</xml_diff>